<commit_message>
Update Contractor Web Zone cover letter and match report with GTM/Yelp findings
Co-Authored-By: Claude Opus 5 <noreply@anthropic.com>
Claude-Session: https://claude.ai/code/session_012bgCHkXVGvrCAAv9cv5gL6
</commit_message>
<xml_diff>
--- a/applications/contractor-web-zone-seo-paid-search-strategist/Rotenberg Resume - Contractor Web Zone - SEO & Paid Search Strategist.docx
+++ b/applications/contractor-web-zone-seo-paid-search-strategist/Rotenberg Resume - Contractor Web Zone - SEO & Paid Search Strategist.docx
@@ -249,7 +249,7 @@
           <w:i w:val="0"/>
           <w:color w:val="1A1A1A"/>
         </w:rPr>
-        <w:t>Run discovery directly with business owners to define which services, cities, and pages actually merit investment, then build the pages and campaigns to match.</w:t>
+        <w:t>Install and configure Google Tag Manager and conversion tracking on every client website built, validating tags before launch.</w:t>
       </w:r>
     </w:p>
     <w:p>
@@ -519,7 +519,7 @@
           <w:i w:val="0"/>
           <w:color w:val="1A1A1A"/>
         </w:rPr>
-        <w:t>Google Ads Campaign Build &amp; Management, Geo-Targeting &amp; Negative Keywords, Conversion Tracking, Technical SEO Audits, Google Business Profile, NAP Consistency &amp; Citations</w:t>
+        <w:t>Google Ads Campaign Build &amp; Management, Geo-Targeting &amp; Negative Keywords, Conversion Tracking, Google Tag Manager, Technical SEO Audits, Google Business Profile, NAP Consistency &amp; Citations</w:t>
       </w:r>
     </w:p>
     <w:p>

</xml_diff>